<commit_message>
Oppdater innleveringsrapporten (ny versjon av Mal DAT158 innlevering 2.docx)
Co-Authored-By: Claude Opus 5.5 <noreply@anthropic.com>
</commit_message>
<xml_diff>
--- a/Mal DAT158 innlevering 2.docx
+++ b/Mal DAT158 innlevering 2.docx
@@ -5,6 +5,8 @@
     <w:p>
       <w:pPr>
         <w:pStyle w:val="Title"/>
+      </w:pPr>
+      <w:r>
         <w:rPr>
           <w:rFonts w:ascii="Times New Roman" w:eastAsia="Times New Roman" w:hAnsi="Times New Roman" w:cs="Times New Roman"/>
           <w:color w:val="000000" w:themeColor="text1"/>
@@ -12,7 +14,8 @@
           <w:szCs w:val="36"/>
           <w:lang w:val="nb-NO"/>
         </w:rPr>
-      </w:pPr>
+        <w:t xml:space="preserve">ML-prediksjon av lønnsomheten til </w:t>
+      </w:r>
       <w:r>
         <w:rPr>
           <w:rFonts w:ascii="Times New Roman" w:eastAsia="Times New Roman" w:hAnsi="Times New Roman" w:cs="Times New Roman"/>
@@ -21,7 +24,7 @@
           <w:szCs w:val="36"/>
           <w:lang w:val="nb-NO"/>
         </w:rPr>
-        <w:t xml:space="preserve">ML-prediksjon av lønnsomheten til </w:t>
+        <w:t>trading skript</w:t>
       </w:r>
       <w:r>
         <w:rPr>
@@ -31,17 +34,7 @@
           <w:szCs w:val="36"/>
           <w:lang w:val="nb-NO"/>
         </w:rPr>
-        <w:t>trading skript</w:t>
-      </w:r>
-      <w:r>
-        <w:rPr>
-          <w:rFonts w:ascii="Times New Roman" w:eastAsia="Times New Roman" w:hAnsi="Times New Roman" w:cs="Times New Roman"/>
-          <w:color w:val="000000" w:themeColor="text1"/>
-          <w:sz w:val="36"/>
-          <w:szCs w:val="36"/>
-          <w:lang w:val="nb-NO"/>
-        </w:rPr>
-        <w:t xml:space="preserve"> på Bitcoin</w:t>
+        <w:t xml:space="preserve"> </w:t>
       </w:r>
     </w:p>
     <w:p>
@@ -916,6 +909,7 @@
         </w:rPr>
         <w:t xml:space="preserve">r </w:t>
       </w:r>
+      <w:bookmarkStart w:id="1" w:name="_Int_0STkAXmO"/>
       <w:r>
         <w:rPr>
           <w:rFonts w:ascii="Times New Roman" w:eastAsia="Times New Roman" w:hAnsi="Times New Roman" w:cs="Times New Roman"/>
@@ -925,6 +919,7 @@
         </w:rPr>
         <w:t>tradere</w:t>
       </w:r>
+      <w:bookmarkEnd w:id="1"/>
       <w:r>
         <w:rPr>
           <w:rFonts w:ascii="Times New Roman" w:eastAsia="Times New Roman" w:hAnsi="Times New Roman" w:cs="Times New Roman"/>
@@ -1413,8 +1408,8 @@
           <w:lang w:val="nb-NO"/>
         </w:rPr>
       </w:pPr>
-      <w:bookmarkStart w:id="1" w:name="_csfu0yphe8uc"/>
-      <w:bookmarkEnd w:id="1"/>
+      <w:bookmarkStart w:id="2" w:name="_csfu0yphe8uc"/>
+      <w:bookmarkEnd w:id="2"/>
       <w:r>
         <w:rPr>
           <w:rFonts w:ascii="Times New Roman" w:eastAsia="Times New Roman" w:hAnsi="Times New Roman" w:cs="Times New Roman"/>
@@ -1773,7 +1768,7 @@
           <w:szCs w:val="24"/>
           <w:lang w:val="nb-NO"/>
         </w:rPr>
-        <w:t>Long</w:t>
+        <w:t>kjøp</w:t>
       </w:r>
       <w:r>
         <w:rPr>
@@ -1793,17 +1788,27 @@
           <w:szCs w:val="24"/>
           <w:lang w:val="nb-NO"/>
         </w:rPr>
-        <w:t>Short</w:t>
-      </w:r>
-      <w:r>
-        <w:rPr>
-          <w:rFonts w:ascii="Times New Roman" w:eastAsia="Times New Roman" w:hAnsi="Times New Roman" w:cs="Times New Roman"/>
-          <w:color w:val="000000" w:themeColor="text1"/>
-          <w:sz w:val="24"/>
-          <w:szCs w:val="24"/>
-          <w:lang w:val="nb-NO"/>
-        </w:rPr>
-        <w:t xml:space="preserve"> etter salgssignal, snu ved motsatt signal, ordre ved neste lys, 0,10 % kostnad per side og funding. For hvert døgn regnes skriptets faktiske avkastning neste dag, uke og måned. </w:t>
+        <w:t xml:space="preserve">selg </w:t>
+      </w:r>
+      <w:r>
+        <w:rPr>
+          <w:rFonts w:ascii="Times New Roman" w:eastAsia="Times New Roman" w:hAnsi="Times New Roman" w:cs="Times New Roman"/>
+          <w:color w:val="000000" w:themeColor="text1"/>
+          <w:sz w:val="24"/>
+          <w:szCs w:val="24"/>
+          <w:lang w:val="nb-NO"/>
+        </w:rPr>
+        <w:t>etter</w:t>
+      </w:r>
+      <w:r>
+        <w:rPr>
+          <w:rFonts w:ascii="Times New Roman" w:eastAsia="Times New Roman" w:hAnsi="Times New Roman" w:cs="Times New Roman"/>
+          <w:color w:val="000000" w:themeColor="text1"/>
+          <w:sz w:val="24"/>
+          <w:szCs w:val="24"/>
+          <w:lang w:val="nb-NO"/>
+        </w:rPr>
+        <w:t xml:space="preserve"> salgssignal, snu ved motsatt signal, ordre ved neste lys, 0,10 % kostnad per side og funding. For hvert døgn regnes skriptets faktiske avkastning neste dag, uke og måned. </w:t>
       </w:r>
     </w:p>
     <w:p>
@@ -1821,7 +1826,7 @@
             <wp:docPr id="451393520" name="drawing">
               <a:extLst xmlns:a="http://schemas.openxmlformats.org/drawingml/2006/main">
                 <a:ext uri="{FF2B5EF4-FFF2-40B4-BE49-F238E27FC236}">
-                  <a16:creationId xmlns:a16="http://schemas.microsoft.com/office/drawing/2014/main" id="{67EEDC64-D635-4126-B417-42C90501A660}"/>
+                  <a16:creationId xmlns:a16="http://schemas.microsoft.com/office/drawing/2014/main" id="{1FE8B4A1-0F0F-473A-A107-1FB2A0A0F89D}"/>
                 </a:ext>
               </a:extLst>
             </wp:docPr>
@@ -1882,28 +1887,6 @@
           <w:szCs w:val="24"/>
           <w:lang w:val="nb-NO"/>
         </w:rPr>
-        <w:t>Det ble også sett på AUC er area under the curve. AUC høyere enn 0.5 er bedre enn et myntkast. Modellene scoret rundt 0.5 og under. Derfor er ikke modellene veldig gode i å predikere om indikatorene er profitatible</w:t>
-      </w:r>
-    </w:p>
-    <w:p>
-      <w:pPr>
-        <w:spacing w:after="140"/>
-        <w:rPr>
-          <w:rFonts w:ascii="Times New Roman" w:eastAsia="Times New Roman" w:hAnsi="Times New Roman" w:cs="Times New Roman"/>
-          <w:color w:val="000000" w:themeColor="text1"/>
-          <w:sz w:val="24"/>
-          <w:szCs w:val="24"/>
-          <w:lang w:val="nb-NO"/>
-        </w:rPr>
-      </w:pPr>
-      <w:r>
-        <w:rPr>
-          <w:rFonts w:ascii="Times New Roman" w:eastAsia="Times New Roman" w:hAnsi="Times New Roman" w:cs="Times New Roman"/>
-          <w:color w:val="000000" w:themeColor="text1"/>
-          <w:sz w:val="24"/>
-          <w:szCs w:val="24"/>
-          <w:lang w:val="nb-NO"/>
-        </w:rPr>
         <w:t>Labels er konsistente fordi de regnes med samme kode og ikke merkes for hånd. Fasiten er først kjent etter horisonten, så modellen trenes bare på eksempler der fasiten var kjent før testperioden.</w:t>
       </w:r>
       <w:r>
@@ -2038,8 +2021,8 @@
           <w:lang w:val="nb-NO"/>
         </w:rPr>
       </w:pPr>
-      <w:bookmarkStart w:id="2" w:name="_ee1tsoqsmrtn"/>
-      <w:bookmarkEnd w:id="2"/>
+      <w:bookmarkStart w:id="3" w:name="_ee1tsoqsmrtn"/>
+      <w:bookmarkEnd w:id="3"/>
       <w:r>
         <w:rPr>
           <w:rFonts w:ascii="Times New Roman" w:eastAsia="Times New Roman" w:hAnsi="Times New Roman" w:cs="Times New Roman"/>
@@ -2159,7 +2142,7 @@
             <wp:docPr id="1106336761" name="drawing">
               <a:extLst xmlns:a="http://schemas.openxmlformats.org/drawingml/2006/main">
                 <a:ext uri="{FF2B5EF4-FFF2-40B4-BE49-F238E27FC236}">
-                  <a16:creationId xmlns:a16="http://schemas.microsoft.com/office/drawing/2014/main" id="{5C361D28-5ED8-4125-BC06-EB052D294FD7}"/>
+                  <a16:creationId xmlns:a16="http://schemas.microsoft.com/office/drawing/2014/main" id="{77283701-F44B-4CD7-8758-9A9B7C49AA81}"/>
                 </a:ext>
               </a:extLst>
             </wp:docPr>
@@ -2290,16 +2273,8 @@
       <w:pPr>
         <w:rPr>
           <w:rFonts w:ascii="Times New Roman" w:eastAsia="Times New Roman" w:hAnsi="Times New Roman" w:cs="Times New Roman"/>
-          <w:sz w:val="24"/>
-          <w:szCs w:val="24"/>
-          <w:lang w:val="nb-NO"/>
-        </w:rPr>
-      </w:pPr>
-    </w:p>
-    <w:p>
-      <w:pPr>
-        <w:rPr>
-          <w:rFonts w:ascii="Times New Roman" w:eastAsia="Times New Roman" w:hAnsi="Times New Roman" w:cs="Times New Roman"/>
+          <w:b/>
+          <w:bCs/>
           <w:sz w:val="24"/>
           <w:szCs w:val="24"/>
           <w:lang w:val="nb-NO"/>
@@ -2426,7 +2401,7 @@
             <wp:docPr id="1202175022" name="drawing">
               <a:extLst xmlns:a="http://schemas.openxmlformats.org/drawingml/2006/main">
                 <a:ext uri="{FF2B5EF4-FFF2-40B4-BE49-F238E27FC236}">
-                  <a16:creationId xmlns:a16="http://schemas.microsoft.com/office/drawing/2014/main" id="{D7748FEE-5626-4C6E-B1A4-91A66266904A}"/>
+                  <a16:creationId xmlns:a16="http://schemas.microsoft.com/office/drawing/2014/main" id="{0D02AEB0-80BB-4BFF-A804-891B24946C78}"/>
                 </a:ext>
               </a:extLst>
             </wp:docPr>
@@ -2742,6 +2717,7 @@
           <w:rFonts w:ascii="Times New Roman" w:eastAsia="Times New Roman" w:hAnsi="Times New Roman" w:cs="Times New Roman"/>
           <w:sz w:val="24"/>
           <w:szCs w:val="24"/>
+          <w:lang w:val="nb-NO"/>
         </w:rPr>
       </w:pPr>
       <w:r>
@@ -2755,7 +2731,7 @@
             <wp:docPr id="769297247" name="drawing">
               <a:extLst xmlns:a="http://schemas.openxmlformats.org/drawingml/2006/main">
                 <a:ext uri="{FF2B5EF4-FFF2-40B4-BE49-F238E27FC236}">
-                  <a16:creationId xmlns:a16="http://schemas.microsoft.com/office/drawing/2014/main" id="{A21A2A2C-1C77-4A2E-8C0B-5EA9998FBB86}"/>
+                  <a16:creationId xmlns:a16="http://schemas.microsoft.com/office/drawing/2014/main" id="{A005BD60-3169-4BD1-AD18-2289BC3130E5}"/>
                 </a:ext>
               </a:extLst>
             </wp:docPr>
@@ -2801,19 +2777,6 @@
       <w:pPr>
         <w:rPr>
           <w:rFonts w:ascii="Times New Roman" w:eastAsia="Times New Roman" w:hAnsi="Times New Roman" w:cs="Times New Roman"/>
-          <w:i/>
-          <w:iCs/>
-          <w:sz w:val="24"/>
-          <w:szCs w:val="24"/>
-          <w:highlight w:val="green"/>
-          <w:lang w:val="nb-NO"/>
-        </w:rPr>
-      </w:pPr>
-    </w:p>
-    <w:p>
-      <w:pPr>
-        <w:rPr>
-          <w:rFonts w:ascii="Times New Roman" w:eastAsia="Times New Roman" w:hAnsi="Times New Roman" w:cs="Times New Roman"/>
           <w:color w:val="000000" w:themeColor="text1"/>
           <w:sz w:val="24"/>
           <w:szCs w:val="24"/>
@@ -2944,7 +2907,7 @@
             <wp:docPr id="519837855" name="drawing">
               <a:extLst xmlns:a="http://schemas.openxmlformats.org/drawingml/2006/main">
                 <a:ext uri="{FF2B5EF4-FFF2-40B4-BE49-F238E27FC236}">
-                  <a16:creationId xmlns:a16="http://schemas.microsoft.com/office/drawing/2014/main" id="{558E3632-7614-4AB7-9C22-ACB1E2B991E2}"/>
+                  <a16:creationId xmlns:a16="http://schemas.microsoft.com/office/drawing/2014/main" id="{4AD7F4B7-FB52-4C85-8FDB-5F0774C3559E}"/>
                 </a:ext>
               </a:extLst>
             </wp:docPr>
@@ -3215,6 +3178,23 @@
         </w:rPr>
         <w:t xml:space="preserve">Kjøre nettsiden på en server som alltid er på. I dag kjører den lokalt og stopper når PC-en er av. </w:t>
       </w:r>
+    </w:p>
+    <w:p>
+      <w:pPr>
+        <w:pStyle w:val="ListParagraph"/>
+        <w:numPr>
+          <w:ilvl w:val="0"/>
+          <w:numId w:val="6"/>
+        </w:numPr>
+        <w:spacing w:after="60"/>
+        <w:rPr>
+          <w:rFonts w:ascii="Times New Roman" w:eastAsia="Times New Roman" w:hAnsi="Times New Roman" w:cs="Times New Roman"/>
+          <w:color w:val="000000" w:themeColor="text1"/>
+          <w:sz w:val="24"/>
+          <w:szCs w:val="24"/>
+          <w:lang w:val="nb-NO"/>
+        </w:rPr>
+      </w:pPr>
     </w:p>
     <w:p>
       <w:pPr>

</xml_diff>